<commit_message>
Update project descriptions and resume
</commit_message>
<xml_diff>
--- a/resume/Resume_Benjamin_Johnston.docx
+++ b/resume/Resume_Benjamin_Johnston.docx
@@ -31,7 +31,7 @@
           <w:color w:val="444444"/>
           <w:sz w:val="22"/>
         </w:rPr>
-        <w:t>Software Engineer  ·  Automation, APIs &amp; Systems</w:t>
+        <w:t>Software Engineer  ·  Systems, Automation &amp; Open Source</w:t>
       </w:r>
     </w:p>
     <w:p>
@@ -47,14 +47,14 @@
           <w:color w:val="444444"/>
           <w:sz w:val="19"/>
         </w:rPr>
-        <w:t>Columbus, OH  |  (614) 843-3974  |  bejaunst@gmail.com  |  linkedin.com/in/bejaunst  |  github.com/cetio  |  cetio.github.io  |  U.S. Citizen</w:t>
+        <w:t>Columbus, OH | (614) 843-3974 | bejaunst@gmail.com | linkedin.com/in/bejaunst | github.com/cetio | cetio.github.io | U.S. Citizen</w:t>
       </w:r>
     </w:p>
     <w:p>
       <w:pPr>
-        <w:spacing w:before="100" w:after="40" w:line="240" w:lineRule="auto"/>
+        <w:spacing w:before="160" w:after="60" w:line="240" w:lineRule="auto"/>
         <w:pBdr>
-          <w:bottom w:val="single" w:sz="6" w:space="1" w:color="999999"/>
+          <w:bottom w:val="single" w:sz="6" w:space="2" w:color="BBBBBB"/>
         </w:pBdr>
       </w:pPr>
       <w:r>
@@ -73,7 +73,7 @@
         <w:tabs>
           <w:tab w:pos="10800" w:val="right"/>
         </w:tabs>
-        <w:spacing w:before="40" w:after="0" w:line="240" w:lineRule="auto"/>
+        <w:spacing w:before="100" w:after="0" w:line="240" w:lineRule="auto"/>
       </w:pPr>
       <w:r>
         <w:rPr>
@@ -89,9 +89,10 @@
           <w:rFonts w:ascii="Calibri" w:hAnsi="Calibri"/>
           <w:b w:val="0"/>
           <w:i w:val="0"/>
+          <w:color w:val="444444"/>
           <w:sz w:val="21"/>
         </w:rPr>
-        <w:t>Handshake</w:t>
+        <w:t>Handshake  ·  Remote (Contract)</w:t>
       </w:r>
       <w:r>
         <w:tab/>
@@ -109,65 +110,50 @@
     </w:p>
     <w:p>
       <w:pPr>
-        <w:spacing w:before="0" w:after="20" w:line="240" w:lineRule="auto"/>
-      </w:pPr>
-      <w:r>
-        <w:rPr>
-          <w:rFonts w:ascii="Calibri" w:hAnsi="Calibri"/>
-          <w:b w:val="0"/>
-          <w:i/>
-          <w:color w:val="444444"/>
-          <w:sz w:val="20"/>
-        </w:rPr>
-        <w:t>Remote · Contract</w:t>
-      </w:r>
-    </w:p>
-    <w:p>
-      <w:pPr>
         <w:pStyle w:val="ListBullet"/>
-        <w:spacing w:before="0" w:after="20" w:line="240" w:lineRule="auto"/>
-        <w:ind w:left="288" w:hanging="187"/>
+        <w:spacing w:before="0" w:after="60" w:line="240" w:lineRule="auto"/>
+        <w:ind w:left="317" w:hanging="216"/>
       </w:pPr>
       <w:r>
         <w:rPr>
           <w:rFonts w:ascii="Calibri" w:hAnsi="Calibri"/>
           <w:b w:val="0"/>
           <w:i w:val="0"/>
-          <w:sz w:val="20"/>
+          <w:sz w:val="21"/>
         </w:rPr>
-        <w:t>Built AutoHandshake!, a Selenium-based robotic process automation (RPA) suite that eliminated 95% of manual annotation and triage effort across 400+ contractor hours through unattended execution, automatic failure recovery, and full audit trails.</w:t>
+        <w:t>Built AutoHandshake!, a Selenium-based automation suite that eliminated 95% of manual annotation and triage effort across 400+ contractor hours through unattended execution, failure recovery, and audit trails.</w:t>
       </w:r>
     </w:p>
     <w:p>
       <w:pPr>
         <w:pStyle w:val="ListBullet"/>
-        <w:spacing w:before="0" w:after="20" w:line="240" w:lineRule="auto"/>
-        <w:ind w:left="288" w:hanging="187"/>
+        <w:spacing w:before="0" w:after="60" w:line="240" w:lineRule="auto"/>
+        <w:ind w:left="317" w:hanging="216"/>
       </w:pPr>
       <w:r>
         <w:rPr>
           <w:rFonts w:ascii="Calibri" w:hAnsi="Calibri"/>
           <w:b w:val="0"/>
           <w:i w:val="0"/>
-          <w:sz w:val="20"/>
+          <w:sz w:val="21"/>
         </w:rPr>
-        <w:t>Evaluated multimodal AI agents against structured rubrics for response quality, reasoning accuracy, and domain understanding, earning Handshake's Model Validation 2 — Expert credential.</w:t>
+        <w:t>Evaluated multimodal AI agents against structured rubrics for response quality, reasoning accuracy, and domain understanding; earned the Model Validation 2 — Expert credential.</w:t>
       </w:r>
     </w:p>
     <w:p>
       <w:pPr>
         <w:pStyle w:val="ListBullet"/>
-        <w:spacing w:before="0" w:after="20" w:line="240" w:lineRule="auto"/>
-        <w:ind w:left="288" w:hanging="187"/>
+        <w:spacing w:before="0" w:after="60" w:line="240" w:lineRule="auto"/>
+        <w:ind w:left="317" w:hanging="216"/>
       </w:pPr>
       <w:r>
         <w:rPr>
           <w:rFonts w:ascii="Calibri" w:hAnsi="Calibri"/>
           <w:b w:val="0"/>
           <w:i w:val="0"/>
-          <w:sz w:val="20"/>
+          <w:sz w:val="21"/>
         </w:rPr>
-        <w:t>Mentored contractors on platform operations and rubric interpretation, improving team throughput and scoring consistency.</w:t>
+        <w:t>Mentored contractors on platform operations, rubric interpretation, and efficient evaluation workflows.</w:t>
       </w:r>
     </w:p>
     <w:p>
@@ -175,7 +161,7 @@
         <w:tabs>
           <w:tab w:pos="10800" w:val="right"/>
         </w:tabs>
-        <w:spacing w:before="40" w:after="0" w:line="240" w:lineRule="auto"/>
+        <w:spacing w:before="100" w:after="0" w:line="240" w:lineRule="auto"/>
       </w:pPr>
       <w:r>
         <w:rPr>
@@ -191,9 +177,10 @@
           <w:rFonts w:ascii="Calibri" w:hAnsi="Calibri"/>
           <w:b w:val="0"/>
           <w:i w:val="0"/>
+          <w:color w:val="444444"/>
           <w:sz w:val="21"/>
         </w:rPr>
-        <w:t>Self-Employed</w:t>
+        <w:t>Self-Employed  ·  Columbus, OH</w:t>
       </w:r>
       <w:r>
         <w:tab/>
@@ -211,65 +198,50 @@
     </w:p>
     <w:p>
       <w:pPr>
-        <w:spacing w:before="0" w:after="20" w:line="240" w:lineRule="auto"/>
-      </w:pPr>
-      <w:r>
-        <w:rPr>
-          <w:rFonts w:ascii="Calibri" w:hAnsi="Calibri"/>
-          <w:b w:val="0"/>
-          <w:i/>
-          <w:color w:val="444444"/>
-          <w:sz w:val="20"/>
-        </w:rPr>
-        <w:t>Columbus, OH</w:t>
-      </w:r>
-    </w:p>
-    <w:p>
-      <w:pPr>
         <w:pStyle w:val="ListBullet"/>
-        <w:spacing w:before="0" w:after="20" w:line="240" w:lineRule="auto"/>
-        <w:ind w:left="288" w:hanging="187"/>
+        <w:spacing w:before="0" w:after="60" w:line="240" w:lineRule="auto"/>
+        <w:ind w:left="317" w:hanging="216"/>
       </w:pPr>
       <w:r>
         <w:rPr>
           <w:rFonts w:ascii="Calibri" w:hAnsi="Calibri"/>
           <w:b w:val="0"/>
           <w:i w:val="0"/>
-          <w:sz w:val="20"/>
+          <w:sz w:val="21"/>
         </w:rPr>
-        <w:t>Engineered an AI-assisted grading platform with LMS OAuth integration and automated rubric application, achieving ~95% grading accuracy in live classroom use and cutting instructor grading time by 50%.</w:t>
+        <w:t>Built an AI-assisted grading platform with LMS OAuth integration and automated rubric application, reaching ~95% accuracy in real classroom use and cutting instructor grading time in half.</w:t>
       </w:r>
     </w:p>
     <w:p>
       <w:pPr>
         <w:pStyle w:val="ListBullet"/>
-        <w:spacing w:before="0" w:after="20" w:line="240" w:lineRule="auto"/>
-        <w:ind w:left="288" w:hanging="187"/>
+        <w:spacing w:before="0" w:after="60" w:line="240" w:lineRule="auto"/>
+        <w:ind w:left="317" w:hanging="216"/>
       </w:pPr>
       <w:r>
         <w:rPr>
           <w:rFonts w:ascii="Calibri" w:hAnsi="Calibri"/>
           <w:b w:val="0"/>
           <w:i w:val="0"/>
-          <w:sz w:val="20"/>
+          <w:sz w:val="21"/>
         </w:rPr>
-        <w:t>Developed workflow-automation tools and strongly typed API SDKs (OAuth 2.0, REST) for web services and device I/O, replacing fragile JSON shims with reusable, auto-refreshing clients that removed repetitive manual work for clients.</w:t>
+        <w:t>Developed workflow-automation tools and API SDKs for web integration and device I/O, eliminating repetitive manual processes for clients.</w:t>
       </w:r>
     </w:p>
     <w:p>
       <w:pPr>
         <w:pStyle w:val="ListBullet"/>
-        <w:spacing w:before="0" w:after="20" w:line="240" w:lineRule="auto"/>
-        <w:ind w:left="288" w:hanging="187"/>
+        <w:spacing w:before="0" w:after="60" w:line="240" w:lineRule="auto"/>
+        <w:ind w:left="317" w:hanging="216"/>
       </w:pPr>
       <w:r>
         <w:rPr>
           <w:rFonts w:ascii="Calibri" w:hAnsi="Calibri"/>
           <w:b w:val="0"/>
           <w:i w:val="0"/>
-          <w:sz w:val="20"/>
+          <w:sz w:val="21"/>
         </w:rPr>
-        <w:t>Published 30+ open-source projects across D, C#, C, Ruby, and Python — spanning SDKs, developer tooling, and performance-critical libraries.</w:t>
+        <w:t>Authored and maintain 30+ open-source libraries across D, C#, and C, spanning SDKs, developer tooling, and systems programming.</w:t>
       </w:r>
     </w:p>
     <w:p>
@@ -277,7 +249,7 @@
         <w:tabs>
           <w:tab w:pos="10800" w:val="right"/>
         </w:tabs>
-        <w:spacing w:before="40" w:after="0" w:line="240" w:lineRule="auto"/>
+        <w:spacing w:before="100" w:after="0" w:line="240" w:lineRule="auto"/>
       </w:pPr>
       <w:r>
         <w:rPr>
@@ -293,9 +265,10 @@
           <w:rFonts w:ascii="Calibri" w:hAnsi="Calibri"/>
           <w:b w:val="0"/>
           <w:i w:val="0"/>
+          <w:color w:val="444444"/>
           <w:sz w:val="21"/>
         </w:rPr>
-        <w:t>RWS Group</w:t>
+        <w:t>RWS Group  ·  Remote (Contract)</w:t>
       </w:r>
       <w:r>
         <w:tab/>
@@ -313,56 +286,25 @@
     </w:p>
     <w:p>
       <w:pPr>
-        <w:spacing w:before="0" w:after="20" w:line="240" w:lineRule="auto"/>
-      </w:pPr>
-      <w:r>
-        <w:rPr>
-          <w:rFonts w:ascii="Calibri" w:hAnsi="Calibri"/>
-          <w:b w:val="0"/>
-          <w:i/>
-          <w:color w:val="444444"/>
-          <w:sz w:val="20"/>
-        </w:rPr>
-        <w:t>Remote · Contract</w:t>
-      </w:r>
-    </w:p>
-    <w:p>
-      <w:pPr>
         <w:pStyle w:val="ListBullet"/>
-        <w:spacing w:before="0" w:after="20" w:line="240" w:lineRule="auto"/>
-        <w:ind w:left="288" w:hanging="187"/>
+        <w:spacing w:before="0" w:after="60" w:line="240" w:lineRule="auto"/>
+        <w:ind w:left="317" w:hanging="216"/>
       </w:pPr>
       <w:r>
         <w:rPr>
           <w:rFonts w:ascii="Calibri" w:hAnsi="Calibri"/>
           <w:b w:val="0"/>
           <w:i w:val="0"/>
-          <w:sz w:val="20"/>
+          <w:sz w:val="21"/>
         </w:rPr>
-        <w:t>Assessed search relevance and LLM output quality against detailed rubrics across Google query simulations and third-party models, surfacing failure patterns that informed ranking and UX improvements.</w:t>
+        <w:t>Assessed search relevance and LLM output quality against detailed rubrics across Google query simulations and third-party models, identifying failure patterns that informed ranking and UX improvements.</w:t>
       </w:r>
     </w:p>
     <w:p>
       <w:pPr>
-        <w:pStyle w:val="ListBullet"/>
-        <w:spacing w:before="0" w:after="20" w:line="240" w:lineRule="auto"/>
-        <w:ind w:left="288" w:hanging="187"/>
-      </w:pPr>
-      <w:r>
-        <w:rPr>
-          <w:rFonts w:ascii="Calibri" w:hAnsi="Calibri"/>
-          <w:b w:val="0"/>
-          <w:i w:val="0"/>
-          <w:sz w:val="20"/>
-        </w:rPr>
-        <w:t>Documented recurring relevance and safety issues with reproducible examples, improving rubric clarity.</w:t>
-      </w:r>
-    </w:p>
-    <w:p>
-      <w:pPr>
-        <w:spacing w:before="100" w:after="40" w:line="240" w:lineRule="auto"/>
+        <w:spacing w:before="160" w:after="60" w:line="240" w:lineRule="auto"/>
         <w:pBdr>
-          <w:bottom w:val="single" w:sz="6" w:space="1" w:color="999999"/>
+          <w:bottom w:val="single" w:sz="6" w:space="2" w:color="BBBBBB"/>
         </w:pBdr>
       </w:pPr>
       <w:r>
@@ -373,7 +315,7 @@
           <w:color w:val="1A1A1A"/>
           <w:sz w:val="22"/>
         </w:rPr>
-        <w:t>PROJECTS</w:t>
+        <w:t>OPEN SOURCE PROJECTS</w:t>
       </w:r>
     </w:p>
     <w:p>
@@ -381,7 +323,62 @@
         <w:tabs>
           <w:tab w:pos="10800" w:val="right"/>
         </w:tabs>
-        <w:spacing w:before="40" w:after="0" w:line="240" w:lineRule="auto"/>
+        <w:spacing w:before="100" w:after="0" w:line="240" w:lineRule="auto"/>
+      </w:pPr>
+      <w:r>
+        <w:rPr>
+          <w:rFonts w:ascii="Calibri" w:hAnsi="Calibri"/>
+          <w:b/>
+          <w:i w:val="0"/>
+          <w:sz w:val="21"/>
+        </w:rPr>
+        <w:t>Selenium-SDK</w:t>
+      </w:r>
+      <w:r>
+        <w:rPr>
+          <w:rFonts w:ascii="Calibri" w:hAnsi="Calibri"/>
+          <w:b w:val="0"/>
+          <w:i w:val="0"/>
+          <w:color w:val="444444"/>
+          <w:sz w:val="21"/>
+        </w:rPr>
+        <w:t xml:space="preserve">  —  Author &amp; Maintainer  |  D</w:t>
+      </w:r>
+      <w:r>
+        <w:tab/>
+      </w:r>
+      <w:r>
+        <w:rPr>
+          <w:rFonts w:ascii="Calibri" w:hAnsi="Calibri"/>
+          <w:b w:val="0"/>
+          <w:i/>
+          <w:color w:val="444444"/>
+          <w:sz w:val="20"/>
+        </w:rPr>
+      </w:r>
+    </w:p>
+    <w:p>
+      <w:pPr>
+        <w:pStyle w:val="ListBullet"/>
+        <w:spacing w:before="0" w:after="60" w:line="240" w:lineRule="auto"/>
+        <w:ind w:left="317" w:hanging="216"/>
+      </w:pPr>
+      <w:r>
+        <w:rPr>
+          <w:rFonts w:ascii="Calibri" w:hAnsi="Calibri"/>
+          <w:b w:val="0"/>
+          <w:i w:val="0"/>
+          <w:sz w:val="21"/>
+        </w:rPr>
+        <w:t>Authored and maintain the de facto Selenium WebDriver library for the D language: a strongly typed browser-automation API with driver auto-detection, implicit wait synchronization, and full session lifecycle management.</w:t>
+      </w:r>
+    </w:p>
+    <w:p>
+      <w:pPr>
+        <w:tabs>
+          <w:tab w:pos="10800" w:val="right"/>
+        </w:tabs>
+        <w:spacing w:before="100" w:after="0" w:line="240" w:lineRule="auto"/>
       </w:pPr>
       <w:r>
         <w:rPr>
@@ -397,9 +394,10 @@
           <w:rFonts w:ascii="Calibri" w:hAnsi="Calibri"/>
           <w:b w:val="0"/>
           <w:i w:val="0"/>
+          <w:color w:val="444444"/>
           <w:sz w:val="21"/>
         </w:rPr>
-        <w:t xml:space="preserve">  |  D, GTK4, Cairo, REST APIs</w:t>
+        <w:t xml:space="preserve">  |  D, GTK4</w:t>
       </w:r>
       <w:r>
         <w:tab/>
@@ -412,39 +410,22 @@
           <w:color w:val="444444"/>
           <w:sz w:val="20"/>
         </w:rPr>
-        <w:t>2026</w:t>
       </w:r>
     </w:p>
     <w:p>
       <w:pPr>
         <w:pStyle w:val="ListBullet"/>
-        <w:spacing w:before="0" w:after="20" w:line="240" w:lineRule="auto"/>
-        <w:ind w:left="288" w:hanging="187"/>
+        <w:spacing w:before="0" w:after="60" w:line="240" w:lineRule="auto"/>
+        <w:ind w:left="317" w:hanging="216"/>
       </w:pPr>
       <w:r>
         <w:rPr>
           <w:rFonts w:ascii="Calibri" w:hAnsi="Calibri"/>
           <w:b w:val="0"/>
           <w:i w:val="0"/>
-          <w:sz w:val="20"/>
+          <w:sz w:val="21"/>
         </w:rPr>
-        <w:t>Built a cross-platform GTK4 desktop application for chemical-compound exploration featuring an interactive 3D molecular viewer rendered through a custom Cairo pipeline.</w:t>
-      </w:r>
-    </w:p>
-    <w:p>
-      <w:pPr>
-        <w:pStyle w:val="ListBullet"/>
-        <w:spacing w:before="0" w:after="20" w:line="240" w:lineRule="auto"/>
-        <w:ind w:left="288" w:hanging="187"/>
-      </w:pPr>
-      <w:r>
-        <w:rPr>
-          <w:rFonts w:ascii="Calibri" w:hAnsi="Calibri"/>
-          <w:b w:val="0"/>
-          <w:i w:val="0"/>
-          <w:sz w:val="20"/>
-        </w:rPr>
-        <w:t>Unified five scientific data sources (PubChem, Wikipedia, PubMed, PMC, Psychonaut Wiki) behind one lazy-fetching interface with a local AI layer that resolves and merges overlapping entries.</w:t>
+        <w:t>Built a cross-platform desktop app for exploring chemical compounds with interactive 3D molecular visualization, unifying several scientific databases behind one interface with a local AI layer that merges overlapping entries.</w:t>
       </w:r>
     </w:p>
     <w:p>
@@ -452,7 +433,7 @@
         <w:tabs>
           <w:tab w:pos="10800" w:val="right"/>
         </w:tabs>
-        <w:spacing w:before="40" w:after="0" w:line="240" w:lineRule="auto"/>
+        <w:spacing w:before="100" w:after="0" w:line="240" w:lineRule="auto"/>
       </w:pPr>
       <w:r>
         <w:rPr>
@@ -468,9 +449,10 @@
           <w:rFonts w:ascii="Calibri" w:hAnsi="Calibri"/>
           <w:b w:val="0"/>
           <w:i w:val="0"/>
+          <w:color w:val="444444"/>
           <w:sz w:val="21"/>
         </w:rPr>
-        <w:t xml:space="preserve">  |  D, JavaScript, Selenium, WebSockets</w:t>
+        <w:t xml:space="preserve">  |  D, JavaScript</w:t>
       </w:r>
       <w:r>
         <w:tab/>
@@ -483,39 +465,22 @@
           <w:color w:val="444444"/>
           <w:sz w:val="20"/>
         </w:rPr>
-        <w:t>2026</w:t>
       </w:r>
     </w:p>
     <w:p>
       <w:pPr>
         <w:pStyle w:val="ListBullet"/>
-        <w:spacing w:before="0" w:after="20" w:line="240" w:lineRule="auto"/>
-        <w:ind w:left="288" w:hanging="187"/>
+        <w:spacing w:before="0" w:after="60" w:line="240" w:lineRule="auto"/>
+        <w:ind w:left="317" w:hanging="216"/>
       </w:pPr>
       <w:r>
         <w:rPr>
           <w:rFonts w:ascii="Calibri" w:hAnsi="Calibri"/>
           <w:b w:val="0"/>
           <w:i w:val="0"/>
-          <w:sz w:val="20"/>
+          <w:sz w:val="21"/>
         </w:rPr>
-        <w:t>Developed a full-stack real-time companion client with authentication, live dashboards, and WebSocket data feeds for an online strategy game.</w:t>
-      </w:r>
-    </w:p>
-    <w:p>
-      <w:pPr>
-        <w:pStyle w:val="ListBullet"/>
-        <w:spacing w:before="0" w:after="20" w:line="240" w:lineRule="auto"/>
-        <w:ind w:left="288" w:hanging="187"/>
-      </w:pPr>
-      <w:r>
-        <w:rPr>
-          <w:rFonts w:ascii="Calibri" w:hAnsi="Calibri"/>
-          <w:b w:val="0"/>
-          <w:i w:val="0"/>
-          <w:sz w:val="20"/>
-        </w:rPr>
-        <w:t>Streamed live match data (units, research, and map state) over persistent WebSocket connections with minimal performance overhead.</w:t>
+        <w:t>Developed a full-stack real-time companion client for an online strategy game, featuring authentication, live dashboards, and WebSocket data feeds for live match tracking.</w:t>
       </w:r>
     </w:p>
     <w:p>
@@ -523,7 +488,7 @@
         <w:tabs>
           <w:tab w:pos="10800" w:val="right"/>
         </w:tabs>
-        <w:spacing w:before="40" w:after="0" w:line="240" w:lineRule="auto"/>
+        <w:spacing w:before="100" w:after="0" w:line="240" w:lineRule="auto"/>
       </w:pPr>
       <w:r>
         <w:rPr>
@@ -532,16 +497,17 @@
           <w:i w:val="0"/>
           <w:sz w:val="21"/>
         </w:rPr>
-        <w:t>Selenium-SDK &amp; Conductor</w:t>
+        <w:t>Intuit</w:t>
       </w:r>
       <w:r>
         <w:rPr>
           <w:rFonts w:ascii="Calibri" w:hAnsi="Calibri"/>
           <w:b w:val="0"/>
           <w:i w:val="0"/>
+          <w:color w:val="444444"/>
           <w:sz w:val="21"/>
         </w:rPr>
-        <w:t xml:space="preserve">  |  D, OAuth 2.0, REST, HTTP</w:t>
+        <w:t xml:space="preserve">  |  D</w:t>
       </w:r>
       <w:r>
         <w:tab/>
@@ -554,46 +520,29 @@
           <w:color w:val="444444"/>
           <w:sz w:val="20"/>
         </w:rPr>
-        <w:t>2026</w:t>
       </w:r>
     </w:p>
     <w:p>
       <w:pPr>
         <w:pStyle w:val="ListBullet"/>
-        <w:spacing w:before="0" w:after="20" w:line="240" w:lineRule="auto"/>
-        <w:ind w:left="288" w:hanging="187"/>
+        <w:spacing w:before="0" w:after="60" w:line="240" w:lineRule="auto"/>
+        <w:ind w:left="317" w:hanging="216"/>
       </w:pPr>
       <w:r>
         <w:rPr>
           <w:rFonts w:ascii="Calibri" w:hAnsi="Calibri"/>
           <w:b w:val="0"/>
           <w:i w:val="0"/>
-          <w:sz w:val="20"/>
+          <w:sz w:val="21"/>
         </w:rPr>
-        <w:t>Modernized an abandoned Selenium library to full W3C WebDriver compliance with a strongly typed API, browser-driver auto-detection, and session lifecycle management.</w:t>
+        <w:t>Designed an LLM SDK exposing chat completions, streaming, batch embeddings, and tool usage as strongly typed native structures, replacing fragile JSON shims for production inference.</w:t>
       </w:r>
     </w:p>
     <w:p>
       <w:pPr>
-        <w:pStyle w:val="ListBullet"/>
-        <w:spacing w:before="0" w:after="20" w:line="240" w:lineRule="auto"/>
-        <w:ind w:left="288" w:hanging="187"/>
-      </w:pPr>
-      <w:r>
-        <w:rPr>
-          <w:rFonts w:ascii="Calibri" w:hAnsi="Calibri"/>
-          <w:b w:val="0"/>
-          <w:i w:val="0"/>
-          <w:sz w:val="20"/>
-        </w:rPr>
-        <w:t>Built reusable HTTP/OAuth orchestration utilities with automatic token refresh, connection pooling, retry, and circuit breaking for production API integrations.</w:t>
-      </w:r>
-    </w:p>
-    <w:p>
-      <w:pPr>
-        <w:spacing w:before="100" w:after="40" w:line="240" w:lineRule="auto"/>
+        <w:spacing w:before="160" w:after="60" w:line="240" w:lineRule="auto"/>
         <w:pBdr>
-          <w:bottom w:val="single" w:sz="6" w:space="1" w:color="999999"/>
+          <w:bottom w:val="single" w:sz="6" w:space="2" w:color="BBBBBB"/>
         </w:pBdr>
       </w:pPr>
       <w:r>
@@ -609,101 +558,101 @@
     </w:p>
     <w:p>
       <w:pPr>
-        <w:spacing w:before="20" w:after="20" w:line="240" w:lineRule="auto"/>
+        <w:spacing w:before="40" w:after="40" w:line="240" w:lineRule="auto"/>
       </w:pPr>
       <w:r>
         <w:rPr>
           <w:rFonts w:ascii="Calibri" w:hAnsi="Calibri"/>
           <w:b/>
           <w:i w:val="0"/>
-          <w:sz w:val="20"/>
+          <w:sz w:val="21"/>
         </w:rPr>
-        <w:t xml:space="preserve">Languages: </w:t>
+        <w:t xml:space="preserve">Languages:  </w:t>
       </w:r>
       <w:r>
         <w:rPr>
           <w:rFonts w:ascii="Calibri" w:hAnsi="Calibri"/>
           <w:b w:val="0"/>
           <w:i w:val="0"/>
-          <w:sz w:val="20"/>
+          <w:sz w:val="21"/>
         </w:rPr>
-        <w:t>C#, D, C, Python, Ruby, JavaScript, SQL, C++, x86 Assembly, Bash</w:t>
+        <w:t>C#, D, C, Python, Ruby, JavaScript, SQL, C++, x86 Assembly</w:t>
       </w:r>
     </w:p>
     <w:p>
       <w:pPr>
-        <w:spacing w:before="20" w:after="20" w:line="240" w:lineRule="auto"/>
+        <w:spacing w:before="40" w:after="40" w:line="240" w:lineRule="auto"/>
       </w:pPr>
       <w:r>
         <w:rPr>
           <w:rFonts w:ascii="Calibri" w:hAnsi="Calibri"/>
           <w:b/>
           <w:i w:val="0"/>
-          <w:sz w:val="20"/>
+          <w:sz w:val="21"/>
         </w:rPr>
-        <w:t xml:space="preserve">Frameworks &amp; Tools: </w:t>
+        <w:t xml:space="preserve">Tools &amp; Frameworks:  </w:t>
       </w:r>
       <w:r>
         <w:rPr>
           <w:rFonts w:ascii="Calibri" w:hAnsi="Calibri"/>
           <w:b w:val="0"/>
           <w:i w:val="0"/>
-          <w:sz w:val="20"/>
+          <w:sz w:val="21"/>
         </w:rPr>
         <w:t>Selenium / WebDriver, GTK4, Node.js, Git, CMake, CI/CD, Linux</w:t>
       </w:r>
     </w:p>
     <w:p>
       <w:pPr>
-        <w:spacing w:before="20" w:after="20" w:line="240" w:lineRule="auto"/>
+        <w:spacing w:before="40" w:after="40" w:line="240" w:lineRule="auto"/>
       </w:pPr>
       <w:r>
         <w:rPr>
           <w:rFonts w:ascii="Calibri" w:hAnsi="Calibri"/>
           <w:b/>
           <w:i w:val="0"/>
-          <w:sz w:val="20"/>
+          <w:sz w:val="21"/>
         </w:rPr>
-        <w:t xml:space="preserve">Concepts: </w:t>
+        <w:t xml:space="preserve">Concepts:  </w:t>
       </w:r>
       <w:r>
         <w:rPr>
           <w:rFonts w:ascii="Calibri" w:hAnsi="Calibri"/>
           <w:b w:val="0"/>
           <w:i w:val="0"/>
-          <w:sz w:val="20"/>
+          <w:sz w:val="21"/>
         </w:rPr>
-        <w:t>REST APIs, OAuth 2.0, SDK design, browser automation / RPA, LLM integration &amp; evaluation, performance &amp; SIMD optimization, reverse engineering, data pipelines</w:t>
+        <w:t>REST APIs, OAuth 2.0, SDK design, browser automation, LLM integration &amp; evaluation, performance optimization</w:t>
       </w:r>
     </w:p>
     <w:p>
       <w:pPr>
-        <w:spacing w:before="20" w:after="20" w:line="240" w:lineRule="auto"/>
+        <w:spacing w:before="40" w:after="40" w:line="240" w:lineRule="auto"/>
       </w:pPr>
       <w:r>
         <w:rPr>
           <w:rFonts w:ascii="Calibri" w:hAnsi="Calibri"/>
           <w:b/>
           <w:i w:val="0"/>
-          <w:sz w:val="20"/>
+          <w:sz w:val="21"/>
         </w:rPr>
-        <w:t xml:space="preserve">Practices: </w:t>
+        <w:t xml:space="preserve">Practices:  </w:t>
       </w:r>
       <w:r>
         <w:rPr>
           <w:rFonts w:ascii="Calibri" w:hAnsi="Calibri"/>
           <w:b w:val="0"/>
           <w:i w:val="0"/>
-          <w:sz w:val="20"/>
+          <w:sz w:val="21"/>
         </w:rPr>
         <w:t>Agile, Kanban, Test-Driven Development, Code Review</w:t>
       </w:r>
     </w:p>
     <w:p>
       <w:pPr>
-        <w:spacing w:before="100" w:after="40" w:line="240" w:lineRule="auto"/>
+        <w:spacing w:before="160" w:after="60" w:line="240" w:lineRule="auto"/>
         <w:pBdr>
-          <w:bottom w:val="single" w:sz="6" w:space="1" w:color="999999"/>
+          <w:bottom w:val="single" w:sz="6" w:space="2" w:color="BBBBBB"/>
         </w:pBdr>
       </w:pPr>
       <w:r>
@@ -722,7 +671,7 @@
         <w:tabs>
           <w:tab w:pos="10800" w:val="right"/>
         </w:tabs>
-        <w:spacing w:before="40" w:after="0" w:line="240" w:lineRule="auto"/>
+        <w:spacing w:before="100" w:after="0" w:line="240" w:lineRule="auto"/>
       </w:pPr>
       <w:r>
         <w:rPr>
@@ -738,9 +687,10 @@
           <w:rFonts w:ascii="Calibri" w:hAnsi="Calibri"/>
           <w:b w:val="0"/>
           <w:i w:val="0"/>
+          <w:color w:val="444444"/>
           <w:sz w:val="21"/>
         </w:rPr>
-        <w:t xml:space="preserve">  —  Associate of Applied Science (AAS), Software Development</w:t>
+        <w:t xml:space="preserve">  —  AAS, Software Development</w:t>
       </w:r>
       <w:r>
         <w:tab/>
@@ -758,53 +708,53 @@
     </w:p>
     <w:p>
       <w:pPr>
-        <w:spacing w:before="20" w:after="20" w:line="240" w:lineRule="auto"/>
+        <w:spacing w:before="60" w:after="40" w:line="240" w:lineRule="auto"/>
       </w:pPr>
       <w:r>
         <w:rPr>
           <w:rFonts w:ascii="Calibri" w:hAnsi="Calibri"/>
           <w:b/>
           <w:i w:val="0"/>
-          <w:sz w:val="20"/>
+          <w:sz w:val="21"/>
         </w:rPr>
-        <w:t xml:space="preserve">Relevant Coursework: </w:t>
+        <w:t xml:space="preserve">Relevant Coursework:  </w:t>
       </w:r>
       <w:r>
         <w:rPr>
           <w:rFonts w:ascii="Calibri" w:hAnsi="Calibri"/>
           <w:b w:val="0"/>
           <w:i w:val="0"/>
-          <w:sz w:val="20"/>
+          <w:sz w:val="21"/>
         </w:rPr>
-        <w:t>Data Structures &amp; Algorithms, Object-Oriented Programming, SQL &amp; Databases, Artificial Intelligence, Virtualization, Agile &amp; Kanban Methodologies</w:t>
+        <w:t>Data Structures &amp; Algorithms, Object-Oriented Programming, SQL &amp; Databases, Artificial Intelligence, Virtualization, Agile &amp; Kanban</w:t>
       </w:r>
     </w:p>
     <w:p>
       <w:pPr>
-        <w:spacing w:before="20" w:after="20" w:line="240" w:lineRule="auto"/>
+        <w:spacing w:before="40" w:after="40" w:line="240" w:lineRule="auto"/>
       </w:pPr>
       <w:r>
         <w:rPr>
           <w:rFonts w:ascii="Calibri" w:hAnsi="Calibri"/>
           <w:b/>
           <w:i w:val="0"/>
-          <w:sz w:val="20"/>
+          <w:sz w:val="21"/>
         </w:rPr>
-        <w:t xml:space="preserve">Certifications: </w:t>
+        <w:t xml:space="preserve">Certifications:  </w:t>
       </w:r>
       <w:r>
         <w:rPr>
           <w:rFonts w:ascii="Calibri" w:hAnsi="Calibri"/>
           <w:b w:val="0"/>
           <w:i w:val="0"/>
-          <w:sz w:val="20"/>
+          <w:sz w:val="21"/>
         </w:rPr>
-        <w:t>Microsoft Career Essentials (Generative AI, Software Development, Azure AI, Security); GitHub Foundations (PMI); SQL Programming; Handshake Model Validation 2 — Expert</w:t>
+        <w:t>Handshake Model Validation 2 — Expert; GitHub Foundations (PMI); Microsoft Career Essentials (Generative AI, Software Development, Azure AI, Security); SQL Programming</w:t>
       </w:r>
     </w:p>
     <w:sectPr>
       <w:pgSz w:w="12240" w:h="15840"/>
-      <w:pgMar w:top="648" w:right="720" w:bottom="648" w:left="720" w:header="720" w:footer="720" w:gutter="0"/>
+      <w:pgMar w:top="720" w:right="864" w:bottom="720" w:left="864" w:header="720" w:footer="720" w:gutter="0"/>
       <w:cols w:space="720"/>
       <w:docGrid w:linePitch="360"/>
     </w:sectPr>
@@ -1180,7 +1130,7 @@
     </w:pPr>
     <w:rPr>
       <w:rFonts w:ascii="Calibri" w:hAnsi="Calibri"/>
-      <w:sz w:val="20"/>
+      <w:sz w:val="21"/>
     </w:rPr>
   </w:style>
   <w:style w:type="paragraph" w:styleId="Header">

</xml_diff>